<commit_message>
docs: propagar D1/D4/D5 em 01,02,02B,03,04,05,06,07,09,10,12B + PDFs; MHBV-14 historico; NUMEROS_071026
Co-Authored-By: Claude Opus 5.5 <noreply@anthropic.com>
Claude-Session: https://claude.ai/code/session_018dZbTK8QppAy7i2RGLn69S
</commit_message>
<xml_diff>
--- a/MHBV 011026/02_INSTITUCIONAL/MHBV-01_Oficio_Prefeitura.docx
+++ b/MHBV 011026/02_INSTITUCIONAL/MHBV-01_Oficio_Prefeitura.docx
@@ -534,7 +534,7 @@
                 <w:sz w:val="19"/>
                 <w:szCs w:val="19"/>
               </w:rPr>
-              <w:t xml:space="preserve">entreposto cooperativo de mel de ~550 m²</w:t>
+              <w:t xml:space="preserve">entreposto cooperativo de mel de ≈ 666 m² construídos (630 m² úteis), em terreno de ≈ 2.500 m²</w:t>
             </w:r>
             <w:r>
               <w:rPr>
@@ -574,7 +574,7 @@
                 <w:sz w:val="19"/>
                 <w:szCs w:val="19"/>
               </w:rPr>
-              <w:t xml:space="preserve">R$ 3,29 milhões</w:t>
+              <w:t xml:space="preserve">R$ 3,83 milhões</w:t>
             </w:r>
             <w:r>
               <w:rPr>
@@ -824,7 +824,7 @@
           <w:sz w:val="20"/>
           <w:szCs w:val="20"/>
         </w:rPr>
-        <w:t xml:space="preserve">~550 m² de área construída</w:t>
+        <w:t xml:space="preserve">≈ 666 m² de área construída (630 m² úteis), em terreno de ≈ 2.500 m²</w:t>
       </w:r>
       <w:r>
         <w:rPr>
@@ -864,7 +864,7 @@
           <w:sz w:val="20"/>
           <w:szCs w:val="20"/>
         </w:rPr>
-        <w:t xml:space="preserve">R$ 3,29 milhões</w:t>
+        <w:t xml:space="preserve">R$ 3,83 milhões</w:t>
       </w:r>
       <w:r>
         <w:rPr>
@@ -955,7 +955,7 @@
           <w:sz w:val="20"/>
           <w:szCs w:val="20"/>
         </w:rPr>
-        <w:t xml:space="preserve"> construção de ~550 m² no terreno cedido pelo Município, mantido o registro na ADAGRI, nos termos do Decreto nº 9.013/2017 (RIISPOA) e da Portaria SDA/MAPA nº 795/2023, alterada pela Portaria SDA/MAPA nº 1.439/2025, com financiamento do FNE/Banco do Nordeste.</w:t>
+        <w:t xml:space="preserve"> construção de ≈ 666 m² construídos (630 m² úteis) no terreno de ≈ 2.500 m² cedido pelo Município, mantido o registro na ADAGRI, nos termos do Decreto nº 9.013/2017 (RIISPOA) e da Portaria SDA/MAPA nº 795/2023, alterada pela Portaria SDA/MAPA nº 1.439/2025, com financiamento do FNE/Banco do Nordeste.</w:t>
       </w:r>
     </w:p>
     <w:p>
@@ -1076,18 +1076,7 @@
           <w:sz w:val="20"/>
           <w:szCs w:val="20"/>
         </w:rPr>
-        <w:t xml:space="preserve">a)  </w:t>
-      </w:r>
-      <w:r>
-        <w:rPr>
-          <w:rFonts w:ascii="Inter" w:cs="Inter" w:eastAsia="Inter" w:hAnsi="Inter"/>
-          <w:b/>
-          <w:bCs/>
-          <w:color w:val="004B1B"/>
-          <w:sz w:val="20"/>
-          <w:szCs w:val="20"/>
-        </w:rPr>
-        <w:t xml:space="preserve">Declaração de anuência institucional</w:t>
+        <w:t xml:space="preserve">a)  Declaração de anuência institucional</w:t>
       </w:r>
       <w:r>
         <w:rPr>
@@ -1114,27 +1103,16 @@
           <w:sz w:val="20"/>
           <w:szCs w:val="20"/>
         </w:rPr>
-        <w:t xml:space="preserve">b)  </w:t>
-      </w:r>
-      <w:r>
-        <w:rPr>
-          <w:rFonts w:ascii="Inter" w:cs="Inter" w:eastAsia="Inter" w:hAnsi="Inter"/>
-          <w:b/>
-          <w:bCs/>
-          <w:color w:val="004B1B"/>
-          <w:sz w:val="20"/>
-          <w:szCs w:val="20"/>
-        </w:rPr>
-        <w:t xml:space="preserve">Certidão de uso e ocupação do solo</w:t>
-      </w:r>
-      <w:r>
-        <w:rPr>
-          <w:rFonts w:ascii="Inter" w:cs="Inter" w:eastAsia="Inter" w:hAnsi="Inter"/>
-          <w:color w:val="1F2433"/>
-          <w:sz w:val="20"/>
-          <w:szCs w:val="20"/>
-        </w:rPr>
-        <w:t xml:space="preserve"> que ateste a compatibilidade da atividade (CNAE 10.99-6-99) com o terreno a ser indicado;</w:t>
+        <w:t xml:space="preserve">b)  Certidão de uso e ocupação do solo</w:t>
+      </w:r>
+      <w:r>
+        <w:rPr>
+          <w:rFonts w:ascii="Inter" w:cs="Inter" w:eastAsia="Inter" w:hAnsi="Inter"/>
+          <w:color w:val="1F2433"/>
+          <w:sz w:val="20"/>
+          <w:szCs w:val="20"/>
+        </w:rPr>
+        <w:t xml:space="preserve"> que ateste a compatibilidade da atividade (CNAE principal 01.59-8-01 e secundário 10.99-6-99, a confirmar com o contador antes do CNPJ) com o terreno a ser indicado;</w:t>
       </w:r>
     </w:p>
     <w:p>
@@ -1152,27 +1130,16 @@
           <w:sz w:val="20"/>
           <w:szCs w:val="20"/>
         </w:rPr>
-        <w:t xml:space="preserve">c)  </w:t>
-      </w:r>
-      <w:r>
-        <w:rPr>
-          <w:rFonts w:ascii="Inter" w:cs="Inter" w:eastAsia="Inter" w:hAnsi="Inter"/>
-          <w:b/>
-          <w:bCs/>
-          <w:color w:val="004B1B"/>
-          <w:sz w:val="20"/>
-          <w:szCs w:val="20"/>
-        </w:rPr>
-        <w:t xml:space="preserve">Cessão de terreno público</w:t>
-      </w:r>
-      <w:r>
-        <w:rPr>
-          <w:rFonts w:ascii="Inter" w:cs="Inter" w:eastAsia="Inter" w:hAnsi="Inter"/>
-          <w:color w:val="1F2433"/>
-          <w:sz w:val="20"/>
-          <w:szCs w:val="20"/>
-        </w:rPr>
-        <w:t xml:space="preserve"> compatível com cerca de 550 m² construídos mais pátio de carga e descarga e estacionamento [área do terreno A CONFIRMAR com o projeto do entreposto, fev/2027], com acesso viário, rede elétrica e água;</w:t>
+        <w:t xml:space="preserve">c)  Cessão de terreno público</w:t>
+      </w:r>
+      <w:r>
+        <w:rPr>
+          <w:rFonts w:ascii="Inter" w:cs="Inter" w:eastAsia="Inter" w:hAnsi="Inter"/>
+          <w:color w:val="1F2433"/>
+          <w:sz w:val="20"/>
+          <w:szCs w:val="20"/>
+        </w:rPr>
+        <w:t xml:space="preserve"> de cerca de 2.500 m² (≈ 50 × 50 m), para prédio de ≈ 666 m² construídos, pátio de carga e descarga, estacionamento, tratamento de efluentes e reserva de ampliação (dimensionamento preliminar MHBV-18; confirmação no projeto do entreposto, fev/2027), com acesso viário, rede elétrica e água;</w:t>
       </w:r>
     </w:p>
     <w:p>
@@ -1190,18 +1157,7 @@
           <w:sz w:val="20"/>
           <w:szCs w:val="20"/>
         </w:rPr>
-        <w:t xml:space="preserve">d)  </w:t>
-      </w:r>
-      <w:r>
-        <w:rPr>
-          <w:rFonts w:ascii="Inter" w:cs="Inter" w:eastAsia="Inter" w:hAnsi="Inter"/>
-          <w:b/>
-          <w:bCs/>
-          <w:color w:val="004B1B"/>
-          <w:sz w:val="20"/>
-          <w:szCs w:val="20"/>
-        </w:rPr>
-        <w:t xml:space="preserve">Cessão provisória</w:t>
+        <w:t xml:space="preserve">d)  Cessão provisória</w:t>
       </w:r>
       <w:r>
         <w:rPr>
@@ -1288,18 +1244,7 @@
           <w:sz w:val="20"/>
           <w:szCs w:val="20"/>
         </w:rPr>
-        <w:t xml:space="preserve">e)  </w:t>
-      </w:r>
-      <w:r>
-        <w:rPr>
-          <w:rFonts w:ascii="Inter" w:cs="Inter" w:eastAsia="Inter" w:hAnsi="Inter"/>
-          <w:b/>
-          <w:bCs/>
-          <w:color w:val="004B1B"/>
-          <w:sz w:val="20"/>
-          <w:szCs w:val="20"/>
-        </w:rPr>
-        <w:t xml:space="preserve">Agilidade na emissão dos alvarás municipais</w:t>
+        <w:t xml:space="preserve">e)  Agilidade na emissão dos alvarás municipais</w:t>
       </w:r>
       <w:r>
         <w:rPr>
@@ -1326,18 +1271,7 @@
           <w:sz w:val="20"/>
           <w:szCs w:val="20"/>
         </w:rPr>
-        <w:t xml:space="preserve">f)  </w:t>
-      </w:r>
-      <w:r>
-        <w:rPr>
-          <w:rFonts w:ascii="Inter" w:cs="Inter" w:eastAsia="Inter" w:hAnsi="Inter"/>
-          <w:b/>
-          <w:bCs/>
-          <w:color w:val="004B1B"/>
-          <w:sz w:val="20"/>
-          <w:szCs w:val="20"/>
-        </w:rPr>
-        <w:t xml:space="preserve">Apoio à mobilização das associações rurais</w:t>
+        <w:t xml:space="preserve">f)  Apoio à mobilização das associações rurais</w:t>
       </w:r>
       <w:r>
         <w:rPr>
@@ -1364,18 +1298,7 @@
           <w:sz w:val="20"/>
           <w:szCs w:val="20"/>
         </w:rPr>
-        <w:t xml:space="preserve">g)  </w:t>
-      </w:r>
-      <w:r>
-        <w:rPr>
-          <w:rFonts w:ascii="Inter" w:cs="Inter" w:eastAsia="Inter" w:hAnsi="Inter"/>
-          <w:b/>
-          <w:bCs/>
-          <w:color w:val="004B1B"/>
-          <w:sz w:val="20"/>
-          <w:szCs w:val="20"/>
-        </w:rPr>
-        <w:t xml:space="preserve">Apoio à captação de recursos</w:t>
+        <w:t xml:space="preserve">g)  Apoio à captação de recursos</w:t>
       </w:r>
       <w:r>
         <w:rPr>
@@ -1402,18 +1325,7 @@
           <w:sz w:val="20"/>
           <w:szCs w:val="20"/>
         </w:rPr>
-        <w:t xml:space="preserve">h)  </w:t>
-      </w:r>
-      <w:r>
-        <w:rPr>
-          <w:rFonts w:ascii="Inter" w:cs="Inter" w:eastAsia="Inter" w:hAnsi="Inter"/>
-          <w:b/>
-          <w:bCs/>
-          <w:color w:val="004B1B"/>
-          <w:sz w:val="20"/>
-          <w:szCs w:val="20"/>
-        </w:rPr>
-        <w:t xml:space="preserve">Articulação institucional com a ADAGRI</w:t>
+        <w:t xml:space="preserve">h)  Articulação institucional com a ADAGRI</w:t>
       </w:r>
       <w:r>
         <w:rPr>
@@ -2174,7 +2086,7 @@
                 <w:sz w:val="17"/>
                 <w:szCs w:val="17"/>
               </w:rPr>
-              <w:t xml:space="preserve">Entreposto de ~550 m²; 10 empregos fixos</w:t>
+              <w:t xml:space="preserve">Entreposto de ≈ 666 m² em terreno de ≈ 2.500 m²; 10 empregos fixos</w:t>
             </w:r>
           </w:p>
         </w:tc>
@@ -2469,7 +2381,7 @@
         <w:sz w:val="15"/>
         <w:szCs w:val="15"/>
       </w:rPr>
-      <w:t xml:space="preserve">Emissão: MHBV 011026 (01/10/2026) · Comissão Organizadora · Boa Viagem/CE · (88) 99726-4831</w:t>
+      <w:t xml:space="preserve">Emissão: MHBV 071026 (07/10/2026) · Comissão Organizadora · Boa Viagem/CE · (88) 99726-4831</w:t>
     </w:r>
   </w:p>
 </w:ftr>
@@ -2695,7 +2607,7 @@
         <w:sz w:val="14"/>
         <w:szCs w:val="14"/>
       </w:rPr>
-      <w:t xml:space="preserve">	MHBV-01 · MHBV 011026 (01/10/2026)</w:t>
+      <w:t xml:space="preserve">	MHBV-01 · MHBV 071026 (07/10/2026)</w:t>
     </w:r>
   </w:p>
   <w:p>

</xml_diff>